<commit_message>
how hex, binary works, pre subnetting
</commit_message>
<xml_diff>
--- a/day 2/Binary, hex, IP address, mac address, pre subnetting.docx
+++ b/day 2/Binary, hex, IP address, mac address, pre subnetting.docx
@@ -74,7 +74,15 @@
     <w:p/>
     <w:p>
       <w:r>
-        <w:t>To find out ip address and mac address in windows use command: ipconfig /all</w:t>
+        <w:t xml:space="preserve">To find out </w:t>
+      </w:r>
+      <w:proofErr w:type="spellStart"/>
+      <w:r>
+        <w:t>ip</w:t>
+      </w:r>
+      <w:proofErr w:type="spellEnd"/>
+      <w:r>
+        <w:t xml:space="preserve"> address and mac address in windows use command: ipconfig /all</w:t>
       </w:r>
     </w:p>
     <w:p>
@@ -114,7 +122,15 @@
     </w:p>
     <w:p>
       <w:r>
-        <w:t>Then take the number and analyse it if its greater or equal to 1</w:t>
+        <w:t xml:space="preserve">Then take the number and </w:t>
+      </w:r>
+      <w:proofErr w:type="spellStart"/>
+      <w:r>
+        <w:t>analyse</w:t>
+      </w:r>
+      <w:proofErr w:type="spellEnd"/>
+      <w:r>
+        <w:t xml:space="preserve"> it if its greater or equal to 1</w:t>
       </w:r>
       <w:r>
         <w:rPr>
@@ -123,7 +139,23 @@
         <w:t>st</w:t>
       </w:r>
       <w:r>
-        <w:t xml:space="preserve"> element of bit table i.e 128, if its true then write 1 or else false. 192&gt;=128 so 1</w:t>
+        <w:t xml:space="preserve"> element of bit table </w:t>
+      </w:r>
+      <w:proofErr w:type="spellStart"/>
+      <w:r>
+        <w:t>i.e</w:t>
+      </w:r>
+      <w:proofErr w:type="spellEnd"/>
+      <w:r>
+        <w:t xml:space="preserve"> 128, if </w:t>
+      </w:r>
+      <w:proofErr w:type="spellStart"/>
+      <w:r>
+        <w:t>its</w:t>
+      </w:r>
+      <w:proofErr w:type="spellEnd"/>
+      <w:r>
+        <w:t xml:space="preserve"> true then write 1 or else false. 192&gt;=128 so 1</w:t>
       </w:r>
       <w:r>
         <w:rPr>
@@ -141,8 +173,13 @@
       </w:r>
     </w:p>
     <w:p>
-      <w:r>
-        <w:t>i.e 190-128=62</w:t>
+      <w:proofErr w:type="spellStart"/>
+      <w:r>
+        <w:t>i.e</w:t>
+      </w:r>
+      <w:proofErr w:type="spellEnd"/>
+      <w:r>
+        <w:t xml:space="preserve"> 190-128=62</w:t>
       </w:r>
     </w:p>
     <w:p>
@@ -157,7 +194,15 @@
         <w:t>nd</w:t>
       </w:r>
       <w:r>
-        <w:t xml:space="preserve"> number analyse with 2</w:t>
+        <w:t xml:space="preserve"> number </w:t>
+      </w:r>
+      <w:proofErr w:type="spellStart"/>
+      <w:r>
+        <w:t>analyse</w:t>
+      </w:r>
+      <w:proofErr w:type="spellEnd"/>
+      <w:r>
+        <w:t xml:space="preserve"> with 2</w:t>
       </w:r>
       <w:r>
         <w:rPr>
@@ -214,11 +259,19 @@
     </w:p>
     <w:p>
       <w:r>
+        <w:t>.</w:t>
+      </w:r>
+    </w:p>
+    <w:p>
+      <w:r>
         <w:t>EVIDENCES:</w:t>
       </w:r>
     </w:p>
     <w:p>
       <w:r>
+        <w:rPr>
+          <w:noProof/>
+        </w:rPr>
         <w:drawing>
           <wp:anchor distT="0" distB="0" distL="114300" distR="114300" simplePos="0" relativeHeight="251659264" behindDoc="0" locked="0" layoutInCell="1" allowOverlap="1" wp14:anchorId="72299F2A" wp14:editId="41CC0B50">
             <wp:simplePos x="0" y="0"/>
@@ -276,6 +329,10 @@
     <w:p/>
     <w:p>
       <w:r>
+        <w:rPr>
+          <w:noProof/>
+        </w:rPr>
+        <w:lastRenderedPageBreak/>
         <w:drawing>
           <wp:anchor distT="0" distB="0" distL="114300" distR="114300" simplePos="0" relativeHeight="251661312" behindDoc="0" locked="0" layoutInCell="1" allowOverlap="1" wp14:anchorId="260A7239" wp14:editId="0FF3AEB3">
             <wp:simplePos x="0" y="0"/>
@@ -342,7 +399,9 @@
         </w:tabs>
       </w:pPr>
       <w:r>
-        <w:lastRenderedPageBreak/>
+        <w:rPr>
+          <w:noProof/>
+        </w:rPr>
         <w:drawing>
           <wp:anchor distT="0" distB="0" distL="114300" distR="114300" simplePos="0" relativeHeight="251663360" behindDoc="0" locked="0" layoutInCell="1" allowOverlap="1" wp14:anchorId="7821C147" wp14:editId="5A5594D7">
             <wp:simplePos x="0" y="0"/>
@@ -415,6 +474,10 @@
     <w:p/>
     <w:p>
       <w:r>
+        <w:rPr>
+          <w:noProof/>
+        </w:rPr>
+        <w:lastRenderedPageBreak/>
         <w:drawing>
           <wp:anchor distT="0" distB="0" distL="114300" distR="114300" simplePos="0" relativeHeight="251665408" behindDoc="0" locked="0" layoutInCell="1" allowOverlap="1" wp14:anchorId="4FC3CC08" wp14:editId="6790838D">
             <wp:simplePos x="0" y="0"/>
@@ -664,6 +727,9 @@
         </w:drawing>
       </w:r>
       <w:r>
+        <w:rPr>
+          <w:noProof/>
+        </w:rPr>
         <w:drawing>
           <wp:anchor distT="0" distB="0" distL="114300" distR="114300" simplePos="0" relativeHeight="251667456" behindDoc="0" locked="0" layoutInCell="1" allowOverlap="1" wp14:anchorId="25C1132D" wp14:editId="2801EC25">
             <wp:simplePos x="0" y="0"/>
@@ -2053,6 +2119,7 @@
   <w:style w:type="character" w:default="1" w:styleId="DefaultParagraphFont">
     <w:name w:val="Default Paragraph Font"/>
     <w:uiPriority w:val="1"/>
+    <w:semiHidden/>
     <w:unhideWhenUsed/>
   </w:style>
   <w:style w:type="table" w:default="1" w:styleId="TableNormal">

</xml_diff>